<commit_message>
Informe final: hallazgo H-03 escalada a root, hashes de flags, anexos actualizados
</commit_message>
<xml_diff>
--- a/reportes/informe_pentesting.docx
+++ b/reportes/informe_pentesting.docx
@@ -4201,15 +4201,9 @@
             </w:pPr>
             <w:r>
               <w:rPr>
-                <w:rFonts w:ascii="Calibri" w:cs="Calibri" w:eastAsia="Calibri" w:hAnsi="Calibri"/>
-                <w:i w:val="1"/>
-                <w:iCs w:val="1"/>
-                <w:color w:val="7f7f7f"/>
-                <w:sz w:val="22"/>
-                <w:szCs w:val="22"/>
-                <w:rtl w:val="0"/>
-              </w:rPr>
-              <w:t xml:space="preserve">(Basic Pentesting / sala de elección)</w:t>
+                <w:rtl w:val="0"/>
+              </w:rPr>
+              <w:t xml:space="preserve">Vulnversity</w:t>
             </w:r>
             <w:r>
               <w:rPr>
@@ -4279,7 +4273,22 @@
                 <w:szCs w:val="22"/>
                 <w:rtl w:val="0"/>
               </w:rPr>
-              <w:t xml:space="preserve">☐ Reconocimiento     ☐ Escaneo     ☐ Explotación     ☐ Post-explotación</w:t>
+              <w:t xml:space="preserve">☐ Reconocimiento     ☐ Escaneo     ☐ Explotación     </w:t>
+            </w:r>
+            <w:r>
+              <w:rPr>
+                <w:rtl w:val="0"/>
+              </w:rPr>
+              <w:t xml:space="preserve">X</w:t>
+            </w:r>
+            <w:r>
+              <w:rPr>
+                <w:rFonts w:ascii="Calibri" w:cs="Calibri" w:eastAsia="Calibri" w:hAnsi="Calibri"/>
+                <w:sz w:val="22"/>
+                <w:szCs w:val="22"/>
+                <w:rtl w:val="0"/>
+              </w:rPr>
+              <w:t xml:space="preserve"> Post-explotación</w:t>
             </w:r>
             <w:r>
               <w:rPr>
@@ -4355,20 +4364,79 @@
               <w:rPr>
                 <w:rtl w:val="0"/>
               </w:rPr>
-              <w:t xml:space="preserve">: Se identificaron múltiples binarios con permiso SUID mediante LinPEAS, incluyendo </w:t>
-            </w:r>
-            <w:r>
-              <w:rPr>
-                <w:rFonts w:ascii="Roboto Mono" w:cs="Roboto Mono" w:eastAsia="Roboto Mono" w:hAnsi="Roboto Mono"/>
-                <w:rtl w:val="0"/>
-              </w:rPr>
-              <w:t xml:space="preserve">/usr/bin/pkexec</w:t>
-            </w:r>
-            <w:r>
-              <w:rPr>
-                <w:rtl w:val="0"/>
-              </w:rPr>
-              <w:t xml:space="preserve">, vulnerable potencialmente a CVE-2021-4034 (PwnKit). Se intentó explotar la vulnerabilidad mediante dos proof-of-concepts distintos sin lograr obtener privilegios de root, posiblemente por incompatibilidades de versión entre el entorno de compilación y el entorno objetivo. La escalada de privilegios queda pendiente de nuevo intento. </w:t>
+              <w:t xml:space="preserve">: Mediante LinPEAS se identificaron binarios con permiso SUID, destacándose </w:t>
+            </w:r>
+            <w:r>
+              <w:rPr>
+                <w:rtl w:val="0"/>
+              </w:rPr>
+              <w:t xml:space="preserve">/bin/systemctl</w:t>
+            </w:r>
+            <w:r>
+              <w:rPr>
+                <w:rtl w:val="0"/>
+              </w:rPr>
+              <w:t xml:space="preserve">, el cual permite a un usuario sin privilegios crear y habilitar un servicio de systemd arbitrario. Se explotó esta configuración incorrecta creando un servicio personalizado cuyo </w:t>
+            </w:r>
+            <w:r>
+              <w:rPr>
+                <w:rtl w:val="0"/>
+              </w:rPr>
+              <w:t xml:space="preserve">ExecStart</w:t>
+            </w:r>
+            <w:r>
+              <w:rPr>
+                <w:rtl w:val="0"/>
+              </w:rPr>
+              <w:t xml:space="preserve"> ejecutaba comandos con privilegios de root, logrando leer </w:t>
+            </w:r>
+            <w:r>
+              <w:rPr>
+                <w:rtl w:val="0"/>
+              </w:rPr>
+              <w:t xml:space="preserve">/etc/shadow</w:t>
+            </w:r>
+            <w:r>
+              <w:rPr>
+                <w:rtl w:val="0"/>
+              </w:rPr>
+              <w:t xml:space="preserve"> y extraer la flag de root ubicada en </w:t>
+            </w:r>
+            <w:r>
+              <w:rPr>
+                <w:rtl w:val="0"/>
+              </w:rPr>
+              <w:t xml:space="preserve">/root/root.txt</w:t>
+            </w:r>
+            <w:r>
+              <w:rPr>
+                <w:rtl w:val="0"/>
+              </w:rPr>
+              <w:t xml:space="preserve">, confirmando la escalada completa de privilegios de </w:t>
+            </w:r>
+            <w:r>
+              <w:rPr>
+                <w:rtl w:val="0"/>
+              </w:rPr>
+              <w:t xml:space="preserve">www-data</w:t>
+            </w:r>
+            <w:r>
+              <w:rPr>
+                <w:rtl w:val="0"/>
+              </w:rPr>
+              <w:t xml:space="preserve"> a </w:t>
+            </w:r>
+            <w:r>
+              <w:rPr>
+                <w:rtl w:val="0"/>
+              </w:rPr>
+              <w:t xml:space="preserve">root</w:t>
+            </w:r>
+            <w:r>
+              <w:rPr>
+                <w:rtl w:val="0"/>
+              </w:rPr>
+              <w:t xml:space="preserve">. </w:t>
             </w:r>
           </w:p>
         </w:tc>
@@ -4428,20 +4496,15 @@
             </w:pPr>
             <w:r>
               <w:rPr>
-                <w:rFonts w:ascii="Calibri" w:cs="Calibri" w:eastAsia="Calibri" w:hAnsi="Calibri"/>
-                <w:i w:val="1"/>
-                <w:iCs w:val="1"/>
-                <w:color w:val="7f7f7f"/>
-                <w:sz w:val="22"/>
-                <w:szCs w:val="22"/>
-                <w:rtl w:val="0"/>
-              </w:rPr>
-              <w:t xml:space="preserve">(Servicio, versión, puerto, URL…)</w:t>
-            </w:r>
-            <w:r>
-              <w:rPr>
-                <w:rtl w:val="0"/>
-              </w:rPr>
+                <w:rtl w:val="0"/>
+              </w:rPr>
+              <w:t xml:space="preserve">/bin/systemctl</w:t>
+            </w:r>
+            <w:r>
+              <w:rPr>
+                <w:rtl w:val="0"/>
+              </w:rPr>
+              <w:t xml:space="preserve"> (permiso SUID mal configurado) </w:t>
             </w:r>
           </w:p>
         </w:tc>
@@ -4501,20 +4564,9 @@
             </w:pPr>
             <w:r>
               <w:rPr>
-                <w:rFonts w:ascii="Calibri" w:cs="Calibri" w:eastAsia="Calibri" w:hAnsi="Calibri"/>
-                <w:i w:val="1"/>
-                <w:iCs w:val="1"/>
-                <w:color w:val="7f7f7f"/>
-                <w:sz w:val="22"/>
-                <w:szCs w:val="22"/>
-                <w:rtl w:val="0"/>
-              </w:rPr>
-              <w:t xml:space="preserve">(Ej.: A05:2021 Security Misconfiguration / CWE-xxx)</w:t>
-            </w:r>
-            <w:r>
-              <w:rPr>
-                <w:rtl w:val="0"/>
-              </w:rPr>
+                <w:rtl w:val="0"/>
+              </w:rPr>
+              <w:t xml:space="preserve">CWE-269 — Improper Privilege Management </w:t>
             </w:r>
           </w:p>
         </w:tc>
@@ -4574,20 +4626,9 @@
             </w:pPr>
             <w:r>
               <w:rPr>
-                <w:rFonts w:ascii="Calibri" w:cs="Calibri" w:eastAsia="Calibri" w:hAnsi="Calibri"/>
-                <w:i w:val="1"/>
-                <w:iCs w:val="1"/>
-                <w:color w:val="7f7f7f"/>
-                <w:sz w:val="22"/>
-                <w:szCs w:val="22"/>
-                <w:rtl w:val="0"/>
-              </w:rPr>
-              <w:t xml:space="preserve">(Ej.: CVE-XXXX-XXXXX o "No aplica")</w:t>
-            </w:r>
-            <w:r>
-              <w:rPr>
-                <w:rtl w:val="0"/>
-              </w:rPr>
+                <w:rtl w:val="0"/>
+              </w:rPr>
+              <w:t xml:space="preserve">No aplica (falla de configuración del sistema, no una CVE pública) </w:t>
             </w:r>
           </w:p>
         </w:tc>
@@ -4652,22 +4693,20 @@
                 <w:szCs w:val="22"/>
                 <w:rtl w:val="0"/>
               </w:rPr>
-              <w:t xml:space="preserve">☐ Bajo     ☐ Medio      </w:t>
-            </w:r>
-            <w:r>
-              <w:rPr>
-                <w:rtl w:val="0"/>
-              </w:rPr>
-              <w:t xml:space="preserve">X </w:t>
-            </w:r>
-            <w:r>
-              <w:rPr>
-                <w:rFonts w:ascii="Calibri" w:cs="Calibri" w:eastAsia="Calibri" w:hAnsi="Calibri"/>
-                <w:sz w:val="22"/>
-                <w:szCs w:val="22"/>
-                <w:rtl w:val="0"/>
-              </w:rPr>
-              <w:t xml:space="preserve">Alto     ☐ Crítico</w:t>
+              <w:t>☐ Bajo     ☐ Medio     ☐ Alto     X Crítico</w:t>
+            </w:r>
+            <w:r>
+              <w:rPr>
+                <w:rtl w:val="0"/>
+              </w:rPr>
+            </w:r>
+            <w:r>
+              <w:rPr>
+                <w:rFonts w:ascii="Calibri" w:cs="Calibri" w:eastAsia="Calibri" w:hAnsi="Calibri"/>
+                <w:sz w:val="22"/>
+                <w:szCs w:val="22"/>
+                <w:rtl w:val="0"/>
+              </w:rPr>
             </w:r>
             <w:r>
               <w:rPr>
@@ -4733,20 +4772,39 @@
             </w:pPr>
             <w:r>
               <w:rPr>
-                <w:rFonts w:ascii="Calibri" w:cs="Calibri" w:eastAsia="Calibri" w:hAnsi="Calibri"/>
-                <w:i w:val="1"/>
-                <w:iCs w:val="1"/>
-                <w:color w:val="7f7f7f"/>
-                <w:sz w:val="22"/>
-                <w:szCs w:val="22"/>
-                <w:rtl w:val="0"/>
-              </w:rPr>
-              <w:t xml:space="preserve">(Archivo en evidencias/ y comando utilizado. Ej.: escaneo_H-01.png)</w:t>
-            </w:r>
-            <w:r>
-              <w:rPr>
-                <w:rtl w:val="0"/>
-              </w:rPr>
+                <w:rtl w:val="0"/>
+              </w:rPr>
+              <w:t xml:space="preserve">postexplotacion_H-03_suid.png</w:t>
+            </w:r>
+            <w:r>
+              <w:rPr>
+                <w:rtl w:val="0"/>
+              </w:rPr>
+              <w:t xml:space="preserve">, </w:t>
+            </w:r>
+            <w:r>
+              <w:rPr>
+                <w:rtl w:val="0"/>
+              </w:rPr>
+              <w:t xml:space="preserve">postexplotacion_H-03_root_shadow.png</w:t>
+            </w:r>
+            <w:r>
+              <w:rPr>
+                <w:rtl w:val="0"/>
+              </w:rPr>
+              <w:t xml:space="preserve">, </w:t>
+            </w:r>
+            <w:r>
+              <w:rPr>
+                <w:rtl w:val="0"/>
+              </w:rPr>
+              <w:t xml:space="preserve">postexplotacion_H-03_rootflag.png</w:t>
+            </w:r>
+            <w:r>
+              <w:rPr>
+                <w:rtl w:val="0"/>
+              </w:rPr>
+              <w:t xml:space="preserve"> </w:t>
             </w:r>
           </w:p>
         </w:tc>
@@ -4806,20 +4864,9 @@
             </w:pPr>
             <w:r>
               <w:rPr>
-                <w:rFonts w:ascii="Calibri" w:cs="Calibri" w:eastAsia="Calibri" w:hAnsi="Calibri"/>
-                <w:i w:val="1"/>
-                <w:iCs w:val="1"/>
-                <w:color w:val="7f7f7f"/>
-                <w:sz w:val="22"/>
-                <w:szCs w:val="22"/>
-                <w:rtl w:val="0"/>
-              </w:rPr>
-              <w:t xml:space="preserve">(Ej.: nmap, gobuster, Burp Suite…)</w:t>
-            </w:r>
-            <w:r>
-              <w:rPr>
-                <w:rtl w:val="0"/>
-              </w:rPr>
+                <w:rtl w:val="0"/>
+              </w:rPr>
+              <w:t xml:space="preserve">LinPEAS, systemctl</w:t>
             </w:r>
           </w:p>
         </w:tc>
@@ -4879,12 +4926,48 @@
             </w:pPr>
             <w:r>
               <w:rPr>
-                <w:rFonts w:ascii="Calibri" w:cs="Calibri" w:eastAsia="Calibri" w:hAnsi="Calibri"/>
-                <w:sz w:val="22"/>
-                <w:szCs w:val="22"/>
-                <w:rtl w:val="0"/>
-              </w:rPr>
-              <w:t xml:space="preserve">☐ Confidencialidad     ☐ Integridad     ☐ Disponibilidad</w:t>
+                <w:rtl w:val="0"/>
+              </w:rPr>
+              <w:t xml:space="preserve">X</w:t>
+            </w:r>
+            <w:r>
+              <w:rPr>
+                <w:rFonts w:ascii="Calibri" w:cs="Calibri" w:eastAsia="Calibri" w:hAnsi="Calibri"/>
+                <w:sz w:val="22"/>
+                <w:szCs w:val="22"/>
+                <w:rtl w:val="0"/>
+              </w:rPr>
+              <w:t xml:space="preserve"> Confidencialidad     </w:t>
+            </w:r>
+            <w:r>
+              <w:rPr>
+                <w:rtl w:val="0"/>
+              </w:rPr>
+              <w:t xml:space="preserve">X</w:t>
+            </w:r>
+            <w:r>
+              <w:rPr>
+                <w:rFonts w:ascii="Calibri" w:cs="Calibri" w:eastAsia="Calibri" w:hAnsi="Calibri"/>
+                <w:sz w:val="22"/>
+                <w:szCs w:val="22"/>
+                <w:rtl w:val="0"/>
+              </w:rPr>
+              <w:t xml:space="preserve"> Integridad     </w:t>
+            </w:r>
+            <w:r>
+              <w:rPr>
+                <w:rtl w:val="0"/>
+              </w:rPr>
+              <w:t xml:space="preserve">X</w:t>
+            </w:r>
+            <w:r>
+              <w:rPr>
+                <w:rFonts w:ascii="Calibri" w:cs="Calibri" w:eastAsia="Calibri" w:hAnsi="Calibri"/>
+                <w:sz w:val="22"/>
+                <w:szCs w:val="22"/>
+                <w:rtl w:val="0"/>
+              </w:rPr>
+              <w:t xml:space="preserve"> Disponibilidad</w:t>
             </w:r>
             <w:r>
               <w:rPr>
@@ -4950,20 +5033,9 @@
             </w:pPr>
             <w:r>
               <w:rPr>
-                <w:rFonts w:ascii="Calibri" w:cs="Calibri" w:eastAsia="Calibri" w:hAnsi="Calibri"/>
-                <w:i w:val="1"/>
-                <w:iCs w:val="1"/>
-                <w:color w:val="7f7f7f"/>
-                <w:sz w:val="22"/>
-                <w:szCs w:val="22"/>
-                <w:rtl w:val="0"/>
-              </w:rPr>
-              <w:t xml:space="preserve">(Parche, configuración o control que lo corrige)</w:t>
-            </w:r>
-            <w:r>
-              <w:rPr>
-                <w:rtl w:val="0"/>
-              </w:rPr>
+                <w:rtl w:val="0"/>
+              </w:rPr>
+              <w:t xml:space="preserve">Eliminar el permiso SUID de /bin/systemctl (no es un uso estándar ni necesario para su funcionamiento normal), y realizar una auditoría periódica de binarios con SUID/SGID en el sistema, ya que su presencia no justificada es una de las vías más comunes de escalada de privilegios en Linux.</w:t>
             </w:r>
           </w:p>
         </w:tc>
@@ -5028,22 +5100,20 @@
                 <w:szCs w:val="22"/>
                 <w:rtl w:val="0"/>
               </w:rPr>
-              <w:t xml:space="preserve">☐ Bajo     </w:t>
-            </w:r>
-            <w:r>
-              <w:rPr>
-                <w:rtl w:val="0"/>
-              </w:rPr>
-              <w:t xml:space="preserve">X</w:t>
-            </w:r>
-            <w:r>
-              <w:rPr>
-                <w:rFonts w:ascii="Calibri" w:cs="Calibri" w:eastAsia="Calibri" w:hAnsi="Calibri"/>
-                <w:sz w:val="22"/>
-                <w:szCs w:val="22"/>
-                <w:rtl w:val="0"/>
-              </w:rPr>
-              <w:t xml:space="preserve"> Medio     ☐ Alto</w:t>
+              <w:t>X Bajo     ☐ Medio     ☐ Alto</w:t>
+            </w:r>
+            <w:r>
+              <w:rPr>
+                <w:rtl w:val="0"/>
+              </w:rPr>
+            </w:r>
+            <w:r>
+              <w:rPr>
+                <w:rFonts w:ascii="Calibri" w:cs="Calibri" w:eastAsia="Calibri" w:hAnsi="Calibri"/>
+                <w:sz w:val="22"/>
+                <w:szCs w:val="22"/>
+                <w:rtl w:val="0"/>
+              </w:rPr>
             </w:r>
             <w:r>
               <w:rPr>
@@ -5291,30 +5361,30 @@
               <w:rPr>
                 <w:rtl w:val="0"/>
               </w:rPr>
-              <w:t xml:space="preserve">1</w:t>
-            </w:r>
-          </w:p>
-        </w:tc>
-        <w:tc>
-          <w:tcPr>
-            <w:tcMar>
-              <w:top w:w="80.0" w:type="dxa"/>
-              <w:left w:w="120.0" w:type="dxa"/>
-              <w:bottom w:w="80.0" w:type="dxa"/>
-              <w:right w:w="120.0" w:type="dxa"/>
-            </w:tcMar>
-            <w:vAlign w:val="top"/>
-          </w:tcPr>
-          <w:p>
-            <w:pPr>
-              <w:spacing w:after="0" w:lineRule="auto"/>
-              <w:rPr/>
-            </w:pPr>
-            <w:r>
-              <w:rPr>
-                <w:rtl w:val="0"/>
-              </w:rPr>
-              <w:t xml:space="preserve">H-02</w:t>
+              <w:t>2</w:t>
+            </w:r>
+          </w:p>
+        </w:tc>
+        <w:tc>
+          <w:tcPr>
+            <w:tcMar>
+              <w:top w:w="80.0" w:type="dxa"/>
+              <w:left w:w="120.0" w:type="dxa"/>
+              <w:bottom w:w="80.0" w:type="dxa"/>
+              <w:right w:w="120.0" w:type="dxa"/>
+            </w:tcMar>
+            <w:vAlign w:val="top"/>
+          </w:tcPr>
+          <w:p>
+            <w:pPr>
+              <w:spacing w:after="0" w:lineRule="auto"/>
+              <w:rPr/>
+            </w:pPr>
+            <w:r>
+              <w:rPr>
+                <w:rtl w:val="0"/>
+              </w:rPr>
+              <w:t>H-02, H-03</w:t>
             </w:r>
           </w:p>
         </w:tc>
@@ -5375,30 +5445,30 @@
               <w:rPr>
                 <w:rtl w:val="0"/>
               </w:rPr>
-              <w:t xml:space="preserve">0</w:t>
-            </w:r>
-          </w:p>
-        </w:tc>
-        <w:tc>
-          <w:tcPr>
-            <w:tcMar>
-              <w:top w:w="80.0" w:type="dxa"/>
-              <w:left w:w="120.0" w:type="dxa"/>
-              <w:bottom w:w="80.0" w:type="dxa"/>
-              <w:right w:w="120.0" w:type="dxa"/>
-            </w:tcMar>
-            <w:vAlign w:val="top"/>
-          </w:tcPr>
-          <w:p>
-            <w:pPr>
-              <w:spacing w:after="0" w:lineRule="auto"/>
-              <w:rPr/>
-            </w:pPr>
-            <w:r>
-              <w:rPr>
-                <w:rtl w:val="0"/>
-              </w:rPr>
-              <w:t xml:space="preserve">-</w:t>
+              <w:t>0</w:t>
+            </w:r>
+          </w:p>
+        </w:tc>
+        <w:tc>
+          <w:tcPr>
+            <w:tcMar>
+              <w:top w:w="80.0" w:type="dxa"/>
+              <w:left w:w="120.0" w:type="dxa"/>
+              <w:bottom w:w="80.0" w:type="dxa"/>
+              <w:right w:w="120.0" w:type="dxa"/>
+            </w:tcMar>
+            <w:vAlign w:val="top"/>
+          </w:tcPr>
+          <w:p>
+            <w:pPr>
+              <w:spacing w:after="0" w:lineRule="auto"/>
+              <w:rPr/>
+            </w:pPr>
+            <w:r>
+              <w:rPr>
+                <w:rtl w:val="0"/>
+              </w:rPr>
+              <w:t>-</w:t>
             </w:r>
           </w:p>
         </w:tc>
@@ -5543,30 +5613,30 @@
               <w:rPr>
                 <w:rtl w:val="0"/>
               </w:rPr>
-              <w:t xml:space="preserve">1</w:t>
-            </w:r>
-          </w:p>
-        </w:tc>
-        <w:tc>
-          <w:tcPr>
-            <w:tcMar>
-              <w:top w:w="80.0" w:type="dxa"/>
-              <w:left w:w="120.0" w:type="dxa"/>
-              <w:bottom w:w="80.0" w:type="dxa"/>
-              <w:right w:w="120.0" w:type="dxa"/>
-            </w:tcMar>
-            <w:vAlign w:val="top"/>
-          </w:tcPr>
-          <w:p>
-            <w:pPr>
-              <w:spacing w:after="0" w:lineRule="auto"/>
-              <w:rPr/>
-            </w:pPr>
-            <w:r>
-              <w:rPr>
-                <w:rtl w:val="0"/>
-              </w:rPr>
-              <w:t xml:space="preserve">H-01</w:t>
+              <w:t>1</w:t>
+            </w:r>
+          </w:p>
+        </w:tc>
+        <w:tc>
+          <w:tcPr>
+            <w:tcMar>
+              <w:top w:w="80.0" w:type="dxa"/>
+              <w:left w:w="120.0" w:type="dxa"/>
+              <w:bottom w:w="80.0" w:type="dxa"/>
+              <w:right w:w="120.0" w:type="dxa"/>
+            </w:tcMar>
+            <w:vAlign w:val="top"/>
+          </w:tcPr>
+          <w:p>
+            <w:pPr>
+              <w:spacing w:after="0" w:lineRule="auto"/>
+              <w:rPr/>
+            </w:pPr>
+            <w:r>
+              <w:rPr>
+                <w:rtl w:val="0"/>
+              </w:rPr>
+              <w:t>H-01</w:t>
             </w:r>
           </w:p>
         </w:tc>
@@ -5640,7 +5710,7 @@
               <w:rPr>
                 <w:rtl w:val="0"/>
               </w:rPr>
-              <w:t xml:space="preserve">2</w:t>
+              <w:t>3</w:t>
             </w:r>
           </w:p>
         </w:tc>
@@ -6915,6 +6985,28 @@
           </w:p>
           <w:p>
             <w:pPr>
+              <w:numPr>
+                <w:ilvl w:val="0"/>
+                <w:numId w:val="2"/>
+              </w:numPr>
+              <w:spacing w:after="0" w:afterAutospacing="0" w:before="240" w:lineRule="auto"/>
+              <w:ind w:left="720" w:hanging="360"/>
+              <w:rPr/>
+            </w:pPr>
+            <w:r>
+              <w:rPr>
+                <w:rtl w:val="0"/>
+              </w:rPr>
+              <w:t>Comandos de escalada de privilegios (systemctl link/enable) documentados en el hallazgo H-03 y en las capturas del Anexo B.</w:t>
+            </w:r>
+            <w:r>
+              <w:rPr>
+                <w:rtl w:val="0"/>
+              </w:rPr>
+            </w:r>
+          </w:p>
+          <w:p>
+            <w:pPr>
               <w:spacing w:after="80" w:lineRule="auto"/>
               <w:rPr>
                 <w:i w:val="1"/>
@@ -7111,6 +7203,87 @@
           </w:p>
           <w:p>
             <w:pPr>
+              <w:numPr>
+                <w:ilvl w:val="0"/>
+                <w:numId w:val="3"/>
+              </w:numPr>
+              <w:spacing w:after="0" w:afterAutospacing="0" w:before="240" w:lineRule="auto"/>
+              <w:ind w:left="720" w:hanging="360"/>
+              <w:rPr/>
+            </w:pPr>
+            <w:r>
+              <w:rPr>
+                <w:rtl w:val="0"/>
+              </w:rPr>
+              <w:t>postexplotacion_H-03_suid.png — permiso SUID activo en /bin/systemctl</w:t>
+            </w:r>
+            <w:r>
+              <w:rPr>
+                <w:rtl w:val="0"/>
+              </w:rPr>
+            </w:r>
+            <w:r>
+              <w:rPr>
+                <w:rtl w:val="0"/>
+              </w:rPr>
+            </w:r>
+          </w:p>
+          <w:p>
+            <w:pPr>
+              <w:numPr>
+                <w:ilvl w:val="0"/>
+                <w:numId w:val="3"/>
+              </w:numPr>
+              <w:spacing w:after="0" w:afterAutospacing="0" w:before="240" w:lineRule="auto"/>
+              <w:ind w:left="720" w:hanging="360"/>
+              <w:rPr/>
+            </w:pPr>
+            <w:r>
+              <w:rPr>
+                <w:rtl w:val="0"/>
+              </w:rPr>
+              <w:t>postexplotacion_H-03_root_shadow.png — lectura de /etc/shadow como root</w:t>
+            </w:r>
+            <w:r>
+              <w:rPr>
+                <w:rtl w:val="0"/>
+              </w:rPr>
+            </w:r>
+            <w:r>
+              <w:rPr>
+                <w:rtl w:val="0"/>
+              </w:rPr>
+            </w:r>
+          </w:p>
+          <w:p>
+            <w:pPr>
+              <w:numPr>
+                <w:ilvl w:val="0"/>
+                <w:numId w:val="3"/>
+              </w:numPr>
+              <w:spacing w:after="0" w:afterAutospacing="0" w:before="240" w:lineRule="auto"/>
+              <w:ind w:left="720" w:hanging="360"/>
+              <w:rPr/>
+            </w:pPr>
+            <w:r>
+              <w:rPr>
+                <w:rtl w:val="0"/>
+              </w:rPr>
+              <w:t>postexplotacion_H-03_rootflag.png — obtención de la root flag</w:t>
+            </w:r>
+            <w:r>
+              <w:rPr>
+                <w:rtl w:val="0"/>
+              </w:rPr>
+            </w:r>
+            <w:r>
+              <w:rPr>
+                <w:rtl w:val="0"/>
+              </w:rPr>
+            </w:r>
+          </w:p>
+          <w:p>
+            <w:pPr>
               <w:spacing w:after="80" w:lineRule="auto"/>
               <w:rPr>
                 <w:i w:val="1"/>
@@ -7242,7 +7415,47 @@
               <w:rPr>
                 <w:rtl w:val="0"/>
               </w:rPr>
-              <w:t xml:space="preserve">No se obtuvieron flags en esta etapa del trabajo. El foco de esta entrega estuvo puesto en la cadena de explotación (RCE vía carga de archivos) y en el intento de escalada de privilegios, documentados en H-02 y H-03. </w:t>
+              <w:t>Formato: flag_id — sha256_hash</w:t>
+            </w:r>
+            <w:r>
+              <w:rPr>
+                <w:rtl w:val="0"/>
+              </w:rPr>
+            </w:r>
+          </w:p>
+          <w:p>
+            <w:pPr>
+              <w:spacing w:after="0" w:lineRule="auto"/>
+              <w:rPr>
+                <w:sz w:val="24"/>
+                <w:szCs w:val="24"/>
+              </w:rPr>
+            </w:pPr>
+            <w:r>
+              <w:rPr>
+                <w:rtl w:val="0"/>
+              </w:rPr>
+              <w:t>H-01 (user flag)  —  d324bd433001e5bdfe39e04d794539c15b51982a5bf6fc78efea46369b7bf956</w:t>
+            </w:r>
+            <w:r>
+              <w:rPr>
+                <w:rtl w:val="0"/>
+              </w:rPr>
+            </w:r>
+          </w:p>
+          <w:p>
+            <w:pPr>
+              <w:spacing w:after="0" w:lineRule="auto"/>
+              <w:rPr>
+                <w:sz w:val="24"/>
+                <w:szCs w:val="24"/>
+              </w:rPr>
+            </w:pPr>
+            <w:r>
+              <w:rPr>
+                <w:rtl w:val="0"/>
+              </w:rPr>
+              <w:t>H-03 (root flag)  —  cfbc740435ad60030304080e35131ffcaf8ac5f71b65e002f5b546aa3cda7ce8</w:t>
             </w:r>
             <w:r>
               <w:rPr>

</xml_diff>